<commit_message>
fix: auditoria completa - versiones reales, RTM verificada, CI y SQA corregidos
</commit_message>
<xml_diff>
--- a/SQA_Plan_Aprovecha.docx
+++ b/SQA_Plan_Aprovecha.docx
@@ -424,7 +424,7 @@
           <w:sz w:val="22"/>
           <w:szCs w:val="22"/>
         </w:rPr>
-        <w:t xml:space="preserve">Análisis estático de código con Detekt + ktlint</w:t>
+        <w:t xml:space="preserve">Análisis estático de código con Detekt</w:t>
       </w:r>
     </w:p>
     <w:p>
@@ -820,7 +820,7 @@
                 <w:sz w:val="20"/>
                 <w:szCs w:val="20"/>
               </w:rPr>
-              <w:t xml:space="preserve">Kotlin 2.2.10</w:t>
+              <w:t xml:space="preserve">Kotlin 2.0.21</w:t>
             </w:r>
           </w:p>
         </w:tc>
@@ -1006,7 +1006,7 @@
                 <w:sz w:val="20"/>
                 <w:szCs w:val="20"/>
               </w:rPr>
-              <w:t xml:space="preserve">Room 2.7.1 (SQLite)</w:t>
+              <w:t xml:space="preserve">Room 2.6.1 (SQLite)</w:t>
             </w:r>
           </w:p>
         </w:tc>
@@ -1130,7 +1130,7 @@
                 <w:sz w:val="20"/>
                 <w:szCs w:val="20"/>
               </w:rPr>
-              <w:t xml:space="preserve">Hilt 2.56.2</w:t>
+              <w:t xml:space="preserve">Hilt 2.51.1</w:t>
             </w:r>
           </w:p>
         </w:tc>
@@ -1192,7 +1192,7 @@
                 <w:sz w:val="20"/>
                 <w:szCs w:val="20"/>
               </w:rPr>
-              <w:t xml:space="preserve">Navigation Compose 2.9.0</w:t>
+              <w:t xml:space="preserve">Navigation Compose 2.8.5</w:t>
             </w:r>
           </w:p>
         </w:tc>
@@ -1915,7 +1915,7 @@
                 <w:sz w:val="20"/>
                 <w:szCs w:val="20"/>
               </w:rPr>
-              <w:t xml:space="preserve">Publicación y listado de packs (REQ-F02, REQ-F03)</w:t>
+              <w:t xml:space="preserve">Listado de packs disponibles (REQ-F03)</w:t>
             </w:r>
           </w:p>
         </w:tc>
@@ -1977,7 +1977,7 @@
                 <w:sz w:val="20"/>
                 <w:szCs w:val="20"/>
               </w:rPr>
-              <w:t xml:space="preserve">Reserva, cancelación y retiro (REQ-F04, REQ-F05, REQ-F06)</w:t>
+              <w:t xml:space="preserve">Publicación de packs y gestión de reservas (REQ-F02, REQ-F04, REQ-F05, REQ-F06)</w:t>
             </w:r>
           </w:p>
         </w:tc>
@@ -3853,7 +3853,7 @@
                 <w:sz w:val="20"/>
                 <w:szCs w:val="20"/>
               </w:rPr>
-              <w:t xml:space="preserve">ktlint (via Detekt)</w:t>
+              <w:t xml:space="preserve">Detekt (reglas de estilo incluidas)</w:t>
             </w:r>
           </w:p>
         </w:tc>
@@ -5323,7 +5323,7 @@
                 <w:sz w:val="20"/>
                 <w:szCs w:val="20"/>
               </w:rPr>
-              <w:t xml:space="preserve">JUnit4 + MockK 1.14.2</w:t>
+              <w:t xml:space="preserve">JUnit4 + MockK 1.13.13</w:t>
             </w:r>
           </w:p>
         </w:tc>
@@ -7979,7 +7979,7 @@
                 <w:sz w:val="20"/>
                 <w:szCs w:val="20"/>
               </w:rPr>
-              <w:t xml:space="preserve">Detekt + ktlint</w:t>
+              <w:t xml:space="preserve">Detekt</w:t>
             </w:r>
           </w:p>
         </w:tc>
@@ -11260,7 +11260,7 @@
                 <w:sz w:val="20"/>
                 <w:szCs w:val="20"/>
               </w:rPr>
-              <w:t xml:space="preserve">Proguard/R8 en release + monitoreo de tamaño en CI build</w:t>
+              <w:t xml:space="preserve">Monitoreo de tamaño del APK (isMinifyEnabled=false en release; ProGuard/R8 pendiente de activar)</w:t>
             </w:r>
           </w:p>
         </w:tc>

</xml_diff>